<commit_message>
Add course instructor to cybercrime paper cover
Co-Authored-By: Claude Opus 5.5 <noreply@anthropic.com>
Claude-Session: https://claude.ai/code/session_019knRdjk5gjNVj1XdaUpgVu
</commit_message>
<xml_diff>
--- a/cybercrime-assignment/final/24-Ahnaf.docx
+++ b/cybercrime-assignment/final/24-Ahnaf.docx
@@ -227,7 +227,35 @@
           <w:sz w:val="24"/>
           <w:szCs w:val="24"/>
         </w:rPr>
-        <w:t xml:space="preserve">[Course Instructor’s Name]</w:t>
+        <w:t xml:space="preserve">Jannatul Hasan, BPM (Bar)</w:t>
+      </w:r>
+    </w:p>
+    <w:p>
+      <w:pPr>
+        <w:spacing w:after="0" w:before="0" w:line="360"/>
+        <w:jc w:val="center"/>
+      </w:pPr>
+      <w:r>
+        <w:rPr>
+          <w:rFonts w:ascii="Times New Roman" w:cs="Times New Roman" w:eastAsia="Times New Roman" w:hAnsi="Times New Roman"/>
+          <w:sz w:val="24"/>
+          <w:szCs w:val="24"/>
+        </w:rPr>
+        <w:t xml:space="preserve">Additional DIG</w:t>
+      </w:r>
+    </w:p>
+    <w:p>
+      <w:pPr>
+        <w:spacing w:after="0" w:before="0" w:line="360"/>
+        <w:jc w:val="center"/>
+      </w:pPr>
+      <w:r>
+        <w:rPr>
+          <w:rFonts w:ascii="Times New Roman" w:cs="Times New Roman" w:eastAsia="Times New Roman" w:hAnsi="Times New Roman"/>
+          <w:sz w:val="24"/>
+          <w:szCs w:val="24"/>
+        </w:rPr>
+        <w:t xml:space="preserve">Course Teacher, MCCJ 525</w:t>
       </w:r>
     </w:p>
     <w:p>

</xml_diff>

<commit_message>
Add illustrative settings figures to cybercrime paper
Co-Authored-By: Claude Opus 5.5 <noreply@anthropic.com>
Claude-Session: https://claude.ai/code/session_019knRdjk5gjNVj1XdaUpgVu
</commit_message>
<xml_diff>
--- a/cybercrime-assignment/final/24-Ahnaf.docx
+++ b/cybercrime-assignment/final/24-Ahnaf.docx
@@ -436,24 +436,72 @@
     </w:p>
     <w:p>
       <w:pPr>
-        <w:pBdr>
-          <w:top w:val="dashed" w:color="9A9A9A" w:sz="6" w:space="30"/>
-          <w:bottom w:val="dashed" w:color="9A9A9A" w:sz="6" w:space="30"/>
-          <w:left w:val="dashed" w:color="9A9A9A" w:sz="6" w:space="8"/>
-          <w:right w:val="dashed" w:color="9A9A9A" w:sz="6" w:space="8"/>
-        </w:pBdr>
-        <w:shd w:fill="F2F2F2" w:color="auto" w:val="clear"/>
-        <w:spacing w:after="200" w:before="60" w:line="360"/>
+        <w:keepNext/>
+        <w:spacing w:after="60" w:before="60"/>
         <w:jc w:val="center"/>
       </w:pPr>
       <w:r>
-        <w:rPr>
-          <w:rFonts w:ascii="Times New Roman" w:cs="Times New Roman" w:eastAsia="Times New Roman" w:hAnsi="Times New Roman"/>
-          <w:color w:val="7A7A7A"/>
-          <w:sz w:val="22"/>
-          <w:szCs w:val="22"/>
-        </w:rPr>
-        <w:t xml:space="preserve">[ Insert your own screenshot here: Facebook → Accounts Center → Password and security ]</w:t>
+        <w:drawing>
+          <wp:inline distT="0" distB="0" distL="0" distR="0">
+            <wp:extent cx="1333500" cy="2124075"/>
+            <wp:effectExtent t="0" r="0" b="0" l="0"/>
+            <wp:docPr id="1" name="fig1" descr="Facebook → Accounts Center → Password and security" title="Figure 1"/>
+            <wp:cNvGraphicFramePr>
+              <a:graphicFrameLocks xmlns:a="http://schemas.openxmlformats.org/drawingml/2006/main" noChangeAspect="1"/>
+            </wp:cNvGraphicFramePr>
+            <a:graphic xmlns:a="http://schemas.openxmlformats.org/drawingml/2006/main">
+              <a:graphicData uri="http://schemas.openxmlformats.org/drawingml/2006/picture">
+                <pic:pic xmlns:pic="http://schemas.openxmlformats.org/drawingml/2006/picture">
+                  <pic:nvPicPr>
+                    <pic:cNvPr id="0" name="" descr=""/>
+                    <pic:cNvPicPr>
+                      <a:picLocks noChangeAspect="1" noChangeArrowheads="1"/>
+                    </pic:cNvPicPr>
+                  </pic:nvPicPr>
+                  <pic:blipFill>
+                    <a:blip r:embed="rId10" cstate="none"/>
+                    <a:srcRect/>
+                    <a:stretch>
+                      <a:fillRect/>
+                    </a:stretch>
+                  </pic:blipFill>
+                  <pic:spPr bwMode="auto">
+                    <a:xfrm>
+                      <a:off x="0" y="0"/>
+                      <a:ext cx="1333500" cy="2124075"/>
+                    </a:xfrm>
+                    <a:prstGeom prst="rect">
+                      <a:avLst/>
+                    </a:prstGeom>
+                  </pic:spPr>
+                </pic:pic>
+              </a:graphicData>
+            </a:graphic>
+          </wp:inline>
+        </w:drawing>
+      </w:r>
+    </w:p>
+    <w:p>
+      <w:pPr>
+        <w:spacing w:after="200" w:line="276"/>
+      </w:pPr>
+      <w:r>
+        <w:rPr>
+          <w:rFonts w:ascii="Times New Roman" w:cs="Times New Roman" w:eastAsia="Times New Roman" w:hAnsi="Times New Roman"/>
+          <w:i/>
+          <w:iCs/>
+          <w:sz w:val="20"/>
+          <w:szCs w:val="20"/>
+        </w:rPr>
+        <w:t xml:space="preserve">Note. </w:t>
+      </w:r>
+      <w:r>
+        <w:rPr>
+          <w:rFonts w:ascii="Times New Roman" w:cs="Times New Roman" w:eastAsia="Times New Roman" w:hAnsi="Times New Roman"/>
+          <w:sz w:val="20"/>
+          <w:szCs w:val="20"/>
+        </w:rPr>
+        <w:t xml:space="preserve">Illustrative recreation of the settings screen, based on the app as of October 2026.</w:t>
       </w:r>
     </w:p>
     <w:p>
@@ -523,24 +571,72 @@
     </w:p>
     <w:p>
       <w:pPr>
-        <w:pBdr>
-          <w:top w:val="dashed" w:color="9A9A9A" w:sz="6" w:space="30"/>
-          <w:bottom w:val="dashed" w:color="9A9A9A" w:sz="6" w:space="30"/>
-          <w:left w:val="dashed" w:color="9A9A9A" w:sz="6" w:space="8"/>
-          <w:right w:val="dashed" w:color="9A9A9A" w:sz="6" w:space="8"/>
-        </w:pBdr>
-        <w:shd w:fill="F2F2F2" w:color="auto" w:val="clear"/>
-        <w:spacing w:after="200" w:before="60" w:line="360"/>
+        <w:keepNext/>
+        <w:spacing w:after="60" w:before="60"/>
         <w:jc w:val="center"/>
       </w:pPr>
       <w:r>
-        <w:rPr>
-          <w:rFonts w:ascii="Times New Roman" w:cs="Times New Roman" w:eastAsia="Times New Roman" w:hAnsi="Times New Roman"/>
-          <w:color w:val="7A7A7A"/>
-          <w:sz w:val="22"/>
-          <w:szCs w:val="22"/>
-        </w:rPr>
-        <w:t xml:space="preserve">[ Insert your own screenshot here: Instagram → Settings → Accounts Center → Password and security ]</w:t>
+        <w:drawing>
+          <wp:inline distT="0" distB="0" distL="0" distR="0">
+            <wp:extent cx="1333500" cy="1943100"/>
+            <wp:effectExtent t="0" r="0" b="0" l="0"/>
+            <wp:docPr id="1" name="fig2" descr="Instagram → Settings → Accounts Center → Password and security" title="Figure 2"/>
+            <wp:cNvGraphicFramePr>
+              <a:graphicFrameLocks xmlns:a="http://schemas.openxmlformats.org/drawingml/2006/main" noChangeAspect="1"/>
+            </wp:cNvGraphicFramePr>
+            <a:graphic xmlns:a="http://schemas.openxmlformats.org/drawingml/2006/main">
+              <a:graphicData uri="http://schemas.openxmlformats.org/drawingml/2006/picture">
+                <pic:pic xmlns:pic="http://schemas.openxmlformats.org/drawingml/2006/picture">
+                  <pic:nvPicPr>
+                    <pic:cNvPr id="0" name="" descr=""/>
+                    <pic:cNvPicPr>
+                      <a:picLocks noChangeAspect="1" noChangeArrowheads="1"/>
+                    </pic:cNvPicPr>
+                  </pic:nvPicPr>
+                  <pic:blipFill>
+                    <a:blip r:embed="rId11" cstate="none"/>
+                    <a:srcRect/>
+                    <a:stretch>
+                      <a:fillRect/>
+                    </a:stretch>
+                  </pic:blipFill>
+                  <pic:spPr bwMode="auto">
+                    <a:xfrm>
+                      <a:off x="0" y="0"/>
+                      <a:ext cx="1333500" cy="1943100"/>
+                    </a:xfrm>
+                    <a:prstGeom prst="rect">
+                      <a:avLst/>
+                    </a:prstGeom>
+                  </pic:spPr>
+                </pic:pic>
+              </a:graphicData>
+            </a:graphic>
+          </wp:inline>
+        </w:drawing>
+      </w:r>
+    </w:p>
+    <w:p>
+      <w:pPr>
+        <w:spacing w:after="200" w:line="276"/>
+      </w:pPr>
+      <w:r>
+        <w:rPr>
+          <w:rFonts w:ascii="Times New Roman" w:cs="Times New Roman" w:eastAsia="Times New Roman" w:hAnsi="Times New Roman"/>
+          <w:i/>
+          <w:iCs/>
+          <w:sz w:val="20"/>
+          <w:szCs w:val="20"/>
+        </w:rPr>
+        <w:t xml:space="preserve">Note. </w:t>
+      </w:r>
+      <w:r>
+        <w:rPr>
+          <w:rFonts w:ascii="Times New Roman" w:cs="Times New Roman" w:eastAsia="Times New Roman" w:hAnsi="Times New Roman"/>
+          <w:sz w:val="20"/>
+          <w:szCs w:val="20"/>
+        </w:rPr>
+        <w:t xml:space="preserve">Illustrative recreation of the settings screen, based on the app as of October 2026.</w:t>
       </w:r>
     </w:p>
     <w:p>
@@ -610,24 +706,72 @@
     </w:p>
     <w:p>
       <w:pPr>
-        <w:pBdr>
-          <w:top w:val="dashed" w:color="9A9A9A" w:sz="6" w:space="30"/>
-          <w:bottom w:val="dashed" w:color="9A9A9A" w:sz="6" w:space="30"/>
-          <w:left w:val="dashed" w:color="9A9A9A" w:sz="6" w:space="8"/>
-          <w:right w:val="dashed" w:color="9A9A9A" w:sz="6" w:space="8"/>
-        </w:pBdr>
-        <w:shd w:fill="F2F2F2" w:color="auto" w:val="clear"/>
-        <w:spacing w:after="200" w:before="60" w:line="360"/>
+        <w:keepNext/>
+        <w:spacing w:after="60" w:before="60"/>
         <w:jc w:val="center"/>
       </w:pPr>
       <w:r>
-        <w:rPr>
-          <w:rFonts w:ascii="Times New Roman" w:cs="Times New Roman" w:eastAsia="Times New Roman" w:hAnsi="Times New Roman"/>
-          <w:color w:val="7A7A7A"/>
-          <w:sz w:val="22"/>
-          <w:szCs w:val="22"/>
-        </w:rPr>
-        <w:t xml:space="preserve">[ Insert your own screenshot here: WhatsApp → Settings → Account → Two-step verification / Privacy → Advanced ]</w:t>
+        <w:drawing>
+          <wp:inline distT="0" distB="0" distL="0" distR="0">
+            <wp:extent cx="1333500" cy="2190750"/>
+            <wp:effectExtent t="0" r="0" b="0" l="0"/>
+            <wp:docPr id="1" name="fig3" descr="WhatsApp → Settings → Account → Two-step verification / Privacy → Advanced" title="Figure 3"/>
+            <wp:cNvGraphicFramePr>
+              <a:graphicFrameLocks xmlns:a="http://schemas.openxmlformats.org/drawingml/2006/main" noChangeAspect="1"/>
+            </wp:cNvGraphicFramePr>
+            <a:graphic xmlns:a="http://schemas.openxmlformats.org/drawingml/2006/main">
+              <a:graphicData uri="http://schemas.openxmlformats.org/drawingml/2006/picture">
+                <pic:pic xmlns:pic="http://schemas.openxmlformats.org/drawingml/2006/picture">
+                  <pic:nvPicPr>
+                    <pic:cNvPr id="0" name="" descr=""/>
+                    <pic:cNvPicPr>
+                      <a:picLocks noChangeAspect="1" noChangeArrowheads="1"/>
+                    </pic:cNvPicPr>
+                  </pic:nvPicPr>
+                  <pic:blipFill>
+                    <a:blip r:embed="rId12" cstate="none"/>
+                    <a:srcRect/>
+                    <a:stretch>
+                      <a:fillRect/>
+                    </a:stretch>
+                  </pic:blipFill>
+                  <pic:spPr bwMode="auto">
+                    <a:xfrm>
+                      <a:off x="0" y="0"/>
+                      <a:ext cx="1333500" cy="2190750"/>
+                    </a:xfrm>
+                    <a:prstGeom prst="rect">
+                      <a:avLst/>
+                    </a:prstGeom>
+                  </pic:spPr>
+                </pic:pic>
+              </a:graphicData>
+            </a:graphic>
+          </wp:inline>
+        </w:drawing>
+      </w:r>
+    </w:p>
+    <w:p>
+      <w:pPr>
+        <w:spacing w:after="200" w:line="276"/>
+      </w:pPr>
+      <w:r>
+        <w:rPr>
+          <w:rFonts w:ascii="Times New Roman" w:cs="Times New Roman" w:eastAsia="Times New Roman" w:hAnsi="Times New Roman"/>
+          <w:i/>
+          <w:iCs/>
+          <w:sz w:val="20"/>
+          <w:szCs w:val="20"/>
+        </w:rPr>
+        <w:t xml:space="preserve">Note. </w:t>
+      </w:r>
+      <w:r>
+        <w:rPr>
+          <w:rFonts w:ascii="Times New Roman" w:cs="Times New Roman" w:eastAsia="Times New Roman" w:hAnsi="Times New Roman"/>
+          <w:sz w:val="20"/>
+          <w:szCs w:val="20"/>
+        </w:rPr>
+        <w:t xml:space="preserve">Illustrative recreation of the settings screen, based on the app as of October 2026.</w:t>
       </w:r>
     </w:p>
     <w:p>
@@ -697,24 +841,72 @@
     </w:p>
     <w:p>
       <w:pPr>
-        <w:pBdr>
-          <w:top w:val="dashed" w:color="9A9A9A" w:sz="6" w:space="30"/>
-          <w:bottom w:val="dashed" w:color="9A9A9A" w:sz="6" w:space="30"/>
-          <w:left w:val="dashed" w:color="9A9A9A" w:sz="6" w:space="8"/>
-          <w:right w:val="dashed" w:color="9A9A9A" w:sz="6" w:space="8"/>
-        </w:pBdr>
-        <w:shd w:fill="F2F2F2" w:color="auto" w:val="clear"/>
-        <w:spacing w:after="200" w:before="60" w:line="360"/>
+        <w:keepNext/>
+        <w:spacing w:after="60" w:before="60"/>
         <w:jc w:val="center"/>
       </w:pPr>
       <w:r>
-        <w:rPr>
-          <w:rFonts w:ascii="Times New Roman" w:cs="Times New Roman" w:eastAsia="Times New Roman" w:hAnsi="Times New Roman"/>
-          <w:color w:val="7A7A7A"/>
-          <w:sz w:val="22"/>
-          <w:szCs w:val="22"/>
-        </w:rPr>
-        <w:t xml:space="preserve">[ Insert your own screenshot here: Google Account → Security → How you sign in to Google ]</w:t>
+        <w:drawing>
+          <wp:inline distT="0" distB="0" distL="0" distR="0">
+            <wp:extent cx="1333500" cy="2009775"/>
+            <wp:effectExtent t="0" r="0" b="0" l="0"/>
+            <wp:docPr id="1" name="fig4" descr="Google Account → Security → How you sign in to Google" title="Figure 4"/>
+            <wp:cNvGraphicFramePr>
+              <a:graphicFrameLocks xmlns:a="http://schemas.openxmlformats.org/drawingml/2006/main" noChangeAspect="1"/>
+            </wp:cNvGraphicFramePr>
+            <a:graphic xmlns:a="http://schemas.openxmlformats.org/drawingml/2006/main">
+              <a:graphicData uri="http://schemas.openxmlformats.org/drawingml/2006/picture">
+                <pic:pic xmlns:pic="http://schemas.openxmlformats.org/drawingml/2006/picture">
+                  <pic:nvPicPr>
+                    <pic:cNvPr id="0" name="" descr=""/>
+                    <pic:cNvPicPr>
+                      <a:picLocks noChangeAspect="1" noChangeArrowheads="1"/>
+                    </pic:cNvPicPr>
+                  </pic:nvPicPr>
+                  <pic:blipFill>
+                    <a:blip r:embed="rId13" cstate="none"/>
+                    <a:srcRect/>
+                    <a:stretch>
+                      <a:fillRect/>
+                    </a:stretch>
+                  </pic:blipFill>
+                  <pic:spPr bwMode="auto">
+                    <a:xfrm>
+                      <a:off x="0" y="0"/>
+                      <a:ext cx="1333500" cy="2009775"/>
+                    </a:xfrm>
+                    <a:prstGeom prst="rect">
+                      <a:avLst/>
+                    </a:prstGeom>
+                  </pic:spPr>
+                </pic:pic>
+              </a:graphicData>
+            </a:graphic>
+          </wp:inline>
+        </w:drawing>
+      </w:r>
+    </w:p>
+    <w:p>
+      <w:pPr>
+        <w:spacing w:after="200" w:line="276"/>
+      </w:pPr>
+      <w:r>
+        <w:rPr>
+          <w:rFonts w:ascii="Times New Roman" w:cs="Times New Roman" w:eastAsia="Times New Roman" w:hAnsi="Times New Roman"/>
+          <w:i/>
+          <w:iCs/>
+          <w:sz w:val="20"/>
+          <w:szCs w:val="20"/>
+        </w:rPr>
+        <w:t xml:space="preserve">Note. </w:t>
+      </w:r>
+      <w:r>
+        <w:rPr>
+          <w:rFonts w:ascii="Times New Roman" w:cs="Times New Roman" w:eastAsia="Times New Roman" w:hAnsi="Times New Roman"/>
+          <w:sz w:val="20"/>
+          <w:szCs w:val="20"/>
+        </w:rPr>
+        <w:t xml:space="preserve">Illustrative recreation of the settings screen, based on the app as of October 2026.</w:t>
       </w:r>
     </w:p>
     <w:p>
@@ -784,24 +976,72 @@
     </w:p>
     <w:p>
       <w:pPr>
-        <w:pBdr>
-          <w:top w:val="dashed" w:color="9A9A9A" w:sz="6" w:space="30"/>
-          <w:bottom w:val="dashed" w:color="9A9A9A" w:sz="6" w:space="30"/>
-          <w:left w:val="dashed" w:color="9A9A9A" w:sz="6" w:space="8"/>
-          <w:right w:val="dashed" w:color="9A9A9A" w:sz="6" w:space="8"/>
-        </w:pBdr>
-        <w:shd w:fill="F2F2F2" w:color="auto" w:val="clear"/>
-        <w:spacing w:after="200" w:before="60" w:line="360"/>
+        <w:keepNext/>
+        <w:spacing w:after="60" w:before="60"/>
         <w:jc w:val="center"/>
       </w:pPr>
       <w:r>
-        <w:rPr>
-          <w:rFonts w:ascii="Times New Roman" w:cs="Times New Roman" w:eastAsia="Times New Roman" w:hAnsi="Times New Roman"/>
-          <w:color w:val="7A7A7A"/>
-          <w:sz w:val="22"/>
-          <w:szCs w:val="22"/>
-        </w:rPr>
-        <w:t xml:space="preserve">[ Insert your own screenshot here: Telegram → Settings → Privacy and Security ]</w:t>
+        <w:drawing>
+          <wp:inline distT="0" distB="0" distL="0" distR="0">
+            <wp:extent cx="1333500" cy="2171700"/>
+            <wp:effectExtent t="0" r="0" b="0" l="0"/>
+            <wp:docPr id="1" name="fig5" descr="Telegram → Settings → Privacy and Security" title="Figure 5"/>
+            <wp:cNvGraphicFramePr>
+              <a:graphicFrameLocks xmlns:a="http://schemas.openxmlformats.org/drawingml/2006/main" noChangeAspect="1"/>
+            </wp:cNvGraphicFramePr>
+            <a:graphic xmlns:a="http://schemas.openxmlformats.org/drawingml/2006/main">
+              <a:graphicData uri="http://schemas.openxmlformats.org/drawingml/2006/picture">
+                <pic:pic xmlns:pic="http://schemas.openxmlformats.org/drawingml/2006/picture">
+                  <pic:nvPicPr>
+                    <pic:cNvPr id="0" name="" descr=""/>
+                    <pic:cNvPicPr>
+                      <a:picLocks noChangeAspect="1" noChangeArrowheads="1"/>
+                    </pic:cNvPicPr>
+                  </pic:nvPicPr>
+                  <pic:blipFill>
+                    <a:blip r:embed="rId14" cstate="none"/>
+                    <a:srcRect/>
+                    <a:stretch>
+                      <a:fillRect/>
+                    </a:stretch>
+                  </pic:blipFill>
+                  <pic:spPr bwMode="auto">
+                    <a:xfrm>
+                      <a:off x="0" y="0"/>
+                      <a:ext cx="1333500" cy="2171700"/>
+                    </a:xfrm>
+                    <a:prstGeom prst="rect">
+                      <a:avLst/>
+                    </a:prstGeom>
+                  </pic:spPr>
+                </pic:pic>
+              </a:graphicData>
+            </a:graphic>
+          </wp:inline>
+        </w:drawing>
+      </w:r>
+    </w:p>
+    <w:p>
+      <w:pPr>
+        <w:spacing w:after="200" w:line="276"/>
+      </w:pPr>
+      <w:r>
+        <w:rPr>
+          <w:rFonts w:ascii="Times New Roman" w:cs="Times New Roman" w:eastAsia="Times New Roman" w:hAnsi="Times New Roman"/>
+          <w:i/>
+          <w:iCs/>
+          <w:sz w:val="20"/>
+          <w:szCs w:val="20"/>
+        </w:rPr>
+        <w:t xml:space="preserve">Note. </w:t>
+      </w:r>
+      <w:r>
+        <w:rPr>
+          <w:rFonts w:ascii="Times New Roman" w:cs="Times New Roman" w:eastAsia="Times New Roman" w:hAnsi="Times New Roman"/>
+          <w:sz w:val="20"/>
+          <w:szCs w:val="20"/>
+        </w:rPr>
+        <w:t xml:space="preserve">Illustrative recreation of the settings screen, based on the app as of October 2026.</w:t>
       </w:r>
     </w:p>
     <w:p>

</xml_diff>

<commit_message>
Revert Section 3 wording and remove added WhatsApp sentence at author's request
Co-Authored-By: Claude Opus 5.5 <noreply@anthropic.com>
Claude-Session: https://claude.ai/code/session_019knRdjk5gjNVj1XdaUpgVu
</commit_message>
<xml_diff>
--- a/cybercrime-assignment/final/24-Ahnaf.docx
+++ b/cybercrime-assignment/final/24-Ahnaf.docx
@@ -941,7 +941,7 @@
       </w:pPr>
       <w:r>
         <w:rPr/>
-        <w:t xml:space="preserve">The strongest security features are mostly optional, hidden or designed for a global audience rather than for Bangladeshi users. Table 1 lists the features I propose.</w:t>
+        <w:t xml:space="preserve">The strongest ones are mostly optional, hidden or designed for a global audience rather than for Bangladeshi users. Table 1 lists the features I propose.</w:t>
       </w:r>
     </w:p>
     <w:p>
@@ -3045,7 +3045,7 @@
       </w:pPr>
       <w:r>
         <w:rPr/>
-        <w:t xml:space="preserve">WhatsApp and Gmail scored the highest (20 out of 25), while bKash scored the lowest (15 out of 25). Of the two, I consider WhatsApp the most secure because its end-to-end encryption works by default. Other platforms like Facebook and Instagram scored moderately (16 out of 25) due to their differences in strength and weakness.</w:t>
+        <w:t xml:space="preserve">WhatsApp and Gmail scored the highest (20 out of 25), while bKash scored the lowest (15 out of 25). Other platforms like Facebook and Instagram scored moderately (16 out of 25) due to their differences in strength and weakness.</w:t>
       </w:r>
     </w:p>
     <w:p>

</xml_diff>

<commit_message>
Replace illustrative figures with the author's real screenshots
Co-Authored-By: Claude Opus 5.5 <noreply@anthropic.com>
Claude-Session: https://claude.ai/code/session_019knRdjk5gjNVj1XdaUpgVu
</commit_message>
<xml_diff>
--- a/cybercrime-assignment/final/24-Ahnaf.docx
+++ b/cybercrime-assignment/final/24-Ahnaf.docx
@@ -380,7 +380,7 @@
           <w:i/>
           <w:iCs/>
         </w:rPr>
-        <w:t>Facebook → Accounts Center → Password and security</w:t>
+        <w:t xml:space="preserve">Facebook → Settings &amp; privacy → Accounts Center → Login and security</w:t>
       </w:r>
     </w:p>
     <w:p>
@@ -395,9 +395,9 @@
         </w:rPr>
         <w:drawing>
           <wp:inline distT="0" distB="0" distL="0" distR="0" wp14:anchorId="797DE5C2" wp14:editId="6DE43B5C">
-            <wp:extent cx="1333500" cy="2124075"/>
+            <wp:extent cx="2377440" cy="3195015"/>
             <wp:effectExtent l="0" t="0" r="0" b="0"/>
-            <wp:docPr id="822376994" name="fig1" descr="Facebook → Accounts Center → Password and security" title="Figure 1"/>
+            <wp:docPr id="822376994" name="fig1" descr="Facebook → Settings &amp; privacy → Accounts Center → Login and security" title="Facebook → Settings &amp; privacy → Accounts Center → Login and security"/>
             <wp:cNvGraphicFramePr>
               <a:graphicFrameLocks xmlns:a="http://schemas.openxmlformats.org/drawingml/2006/main" noChangeAspect="1"/>
             </wp:cNvGraphicFramePr>
@@ -420,7 +420,7 @@
                   <pic:spPr bwMode="auto">
                     <a:xfrm>
                       <a:off x="0" y="0"/>
-                      <a:ext cx="1333500" cy="2124075"/>
+                      <a:ext cx="2377440" cy="3195015"/>
                     </a:xfrm>
                     <a:prstGeom prst="rect">
                       <a:avLst/>
@@ -439,19 +439,19 @@
       </w:pPr>
       <w:r>
         <w:rPr>
+          <w:sz w:val="20"/>
+          <w:szCs w:val="20"/>
           <w:i/>
           <w:iCs/>
+        </w:rPr>
+        <w:t xml:space="preserve">Note. </w:t>
+      </w:r>
+      <w:r>
+        <w:rPr>
           <w:sz w:val="20"/>
           <w:szCs w:val="20"/>
         </w:rPr>
-        <w:t xml:space="preserve">Note. </w:t>
-      </w:r>
-      <w:r>
-        <w:rPr>
-          <w:sz w:val="20"/>
-          <w:szCs w:val="20"/>
-        </w:rPr>
-        <w:t>Illustrative recreation of the settings screen, based on the app as of October 2026.</w:t>
+        <w:t xml:space="preserve">Screenshot taken by the author on 25 October 2026.</w:t>
       </w:r>
     </w:p>
     <w:p>
@@ -497,7 +497,7 @@
           <w:i/>
           <w:iCs/>
         </w:rPr>
-        <w:t>Instagram → Settings → Accounts Center → Password and security</w:t>
+        <w:t xml:space="preserve">Instagram → Profile → Menu → Accounts Center → Password and security</w:t>
       </w:r>
     </w:p>
     <w:p>
@@ -512,9 +512,9 @@
         </w:rPr>
         <w:drawing>
           <wp:inline distT="0" distB="0" distL="0" distR="0" wp14:anchorId="67C62A3C" wp14:editId="384F3CB4">
-            <wp:extent cx="1333500" cy="1943100"/>
+            <wp:extent cx="2377440" cy="2073656"/>
             <wp:effectExtent l="0" t="0" r="0" b="0"/>
-            <wp:docPr id="234644435" name="fig2" descr="Instagram → Settings → Accounts Center → Password and security" title="Figure 2"/>
+            <wp:docPr id="234644435" name="fig2" descr="Instagram → Profile → Menu → Accounts Center → Password and security" title="Instagram → Profile → Menu → Accounts Center → Password and security"/>
             <wp:cNvGraphicFramePr>
               <a:graphicFrameLocks xmlns:a="http://schemas.openxmlformats.org/drawingml/2006/main" noChangeAspect="1"/>
             </wp:cNvGraphicFramePr>
@@ -537,7 +537,7 @@
                   <pic:spPr bwMode="auto">
                     <a:xfrm>
                       <a:off x="0" y="0"/>
-                      <a:ext cx="1333500" cy="1943100"/>
+                      <a:ext cx="2377440" cy="2073656"/>
                     </a:xfrm>
                     <a:prstGeom prst="rect">
                       <a:avLst/>
@@ -556,19 +556,19 @@
       </w:pPr>
       <w:r>
         <w:rPr>
+          <w:sz w:val="20"/>
+          <w:szCs w:val="20"/>
           <w:i/>
           <w:iCs/>
+        </w:rPr>
+        <w:t xml:space="preserve">Note. </w:t>
+      </w:r>
+      <w:r>
+        <w:rPr>
           <w:sz w:val="20"/>
           <w:szCs w:val="20"/>
         </w:rPr>
-        <w:t xml:space="preserve">Note. </w:t>
-      </w:r>
-      <w:r>
-        <w:rPr>
-          <w:sz w:val="20"/>
-          <w:szCs w:val="20"/>
-        </w:rPr>
-        <w:t>Illustrative recreation of the settings screen, based on the app as of October 2026.</w:t>
+        <w:t xml:space="preserve">Screenshot taken by the author on 25 October 2026.</w:t>
       </w:r>
     </w:p>
     <w:p>
@@ -614,7 +614,7 @@
           <w:i/>
           <w:iCs/>
         </w:rPr>
-        <w:t>WhatsApp → Settings → Account → Two-step verification / Privacy → Advanced</w:t>
+        <w:t xml:space="preserve">WhatsApp → Settings → Privacy</w:t>
       </w:r>
     </w:p>
     <w:p>
@@ -629,9 +629,9 @@
         </w:rPr>
         <w:drawing>
           <wp:inline distT="0" distB="0" distL="0" distR="0" wp14:anchorId="52D8975D" wp14:editId="5A3399AF">
-            <wp:extent cx="1333500" cy="2190750"/>
+            <wp:extent cx="2377440" cy="3641446"/>
             <wp:effectExtent l="0" t="0" r="0" b="0"/>
-            <wp:docPr id="1862344118" name="fig3" descr="WhatsApp → Settings → Account → Two-step verification / Privacy → Advanced" title="Figure 3"/>
+            <wp:docPr id="1862344118" name="fig3" descr="WhatsApp → Settings → Privacy" title="WhatsApp → Settings → Privacy"/>
             <wp:cNvGraphicFramePr>
               <a:graphicFrameLocks xmlns:a="http://schemas.openxmlformats.org/drawingml/2006/main" noChangeAspect="1"/>
             </wp:cNvGraphicFramePr>
@@ -654,7 +654,7 @@
                   <pic:spPr bwMode="auto">
                     <a:xfrm>
                       <a:off x="0" y="0"/>
-                      <a:ext cx="1333500" cy="2190750"/>
+                      <a:ext cx="2377440" cy="3641446"/>
                     </a:xfrm>
                     <a:prstGeom prst="rect">
                       <a:avLst/>
@@ -673,19 +673,19 @@
       </w:pPr>
       <w:r>
         <w:rPr>
+          <w:sz w:val="20"/>
+          <w:szCs w:val="20"/>
           <w:i/>
           <w:iCs/>
+        </w:rPr>
+        <w:t xml:space="preserve">Note. </w:t>
+      </w:r>
+      <w:r>
+        <w:rPr>
           <w:sz w:val="20"/>
           <w:szCs w:val="20"/>
         </w:rPr>
-        <w:t xml:space="preserve">Note. </w:t>
-      </w:r>
-      <w:r>
-        <w:rPr>
-          <w:sz w:val="20"/>
-          <w:szCs w:val="20"/>
-        </w:rPr>
-        <w:t>Illustrative recreation of the settings screen, based on the app as of October 2026.</w:t>
+        <w:t xml:space="preserve">Screenshot taken by the author on 25 October 2026.</w:t>
       </w:r>
     </w:p>
     <w:p>
@@ -730,7 +730,7 @@
           <w:i/>
           <w:iCs/>
         </w:rPr>
-        <w:t>Google Account → Security → How you sign in to Google</w:t>
+        <w:t xml:space="preserve">Gmail → Profile picture → Manage your Google Account → Security and sign-in</w:t>
       </w:r>
     </w:p>
     <w:p>
@@ -745,9 +745,9 @@
         </w:rPr>
         <w:drawing>
           <wp:inline distT="0" distB="0" distL="0" distR="0" wp14:anchorId="089BB2AF" wp14:editId="58228A76">
-            <wp:extent cx="1333500" cy="2009775"/>
+            <wp:extent cx="2377440" cy="2316683"/>
             <wp:effectExtent l="0" t="0" r="0" b="0"/>
-            <wp:docPr id="1351789678" name="fig4" descr="Google Account → Security → How you sign in to Google" title="Figure 4"/>
+            <wp:docPr id="1351789678" name="fig4" descr="Gmail → Profile picture → Manage your Google Account → Security and sign-in" title="Gmail → Profile picture → Manage your Google Account → Security and sign-in"/>
             <wp:cNvGraphicFramePr>
               <a:graphicFrameLocks xmlns:a="http://schemas.openxmlformats.org/drawingml/2006/main" noChangeAspect="1"/>
             </wp:cNvGraphicFramePr>
@@ -770,7 +770,7 @@
                   <pic:spPr bwMode="auto">
                     <a:xfrm>
                       <a:off x="0" y="0"/>
-                      <a:ext cx="1333500" cy="2009775"/>
+                      <a:ext cx="2377440" cy="2316683"/>
                     </a:xfrm>
                     <a:prstGeom prst="rect">
                       <a:avLst/>
@@ -789,19 +789,19 @@
       </w:pPr>
       <w:r>
         <w:rPr>
+          <w:sz w:val="20"/>
+          <w:szCs w:val="20"/>
           <w:i/>
           <w:iCs/>
+        </w:rPr>
+        <w:t xml:space="preserve">Note. </w:t>
+      </w:r>
+      <w:r>
+        <w:rPr>
           <w:sz w:val="20"/>
           <w:szCs w:val="20"/>
         </w:rPr>
-        <w:t xml:space="preserve">Note. </w:t>
-      </w:r>
-      <w:r>
-        <w:rPr>
-          <w:sz w:val="20"/>
-          <w:szCs w:val="20"/>
-        </w:rPr>
-        <w:t>Illustrative recreation of the settings screen, based on the app as of October 2026.</w:t>
+        <w:t xml:space="preserve">Screenshot taken by the author on 25 October 2026; personal details have been cropped out.</w:t>
       </w:r>
     </w:p>
     <w:p>
@@ -850,7 +850,7 @@
           <w:i/>
           <w:iCs/>
         </w:rPr>
-        <w:t xml:space="preserve">bKash app → Profile → Touch / Face ID Login</w:t>
+        <w:t xml:space="preserve">bKash app → My Profile → Touch/Face ID (top) and the Forgot PIN screen (bottom)</w:t>
       </w:r>
     </w:p>
     <w:p>
@@ -865,9 +865,9 @@
         </w:rPr>
         <w:drawing>
           <wp:inline distT="0" distB="0" distL="0" distR="0" wp14:anchorId="4026B51F" wp14:editId="27FF4174">
-            <wp:extent cx="1333500" cy="1831808"/>
+            <wp:extent cx="2011680" cy="3492500"/>
             <wp:effectExtent l="0" t="0" r="0" b="0"/>
-            <wp:docPr id="1198581341" name="fig5" descr="Figure 5: bKash app login and security settings (illustrative)" title="Figure 5: bKash app login and security settings (illustrative)"/>
+            <wp:docPr id="1198581341" name="fig5" descr="bKash app → My Profile → Touch/Face ID (top) and the Forgot PIN screen (bottom)" title="bKash app → My Profile → Touch/Face ID (top) and the Forgot PIN screen (bottom)"/>
             <wp:cNvGraphicFramePr>
               <a:graphicFrameLocks xmlns:a="http://schemas.openxmlformats.org/drawingml/2006/main" noChangeAspect="1"/>
             </wp:cNvGraphicFramePr>
@@ -890,7 +890,7 @@
                   <pic:spPr bwMode="auto">
                     <a:xfrm>
                       <a:off x="0" y="0"/>
-                      <a:ext cx="1333500" cy="1831808"/>
+                      <a:ext cx="2011680" cy="3492500"/>
                     </a:xfrm>
                     <a:prstGeom prst="rect">
                       <a:avLst/>
@@ -909,19 +909,19 @@
       </w:pPr>
       <w:r>
         <w:rPr>
+          <w:sz w:val="20"/>
+          <w:szCs w:val="20"/>
           <w:i/>
           <w:iCs/>
+        </w:rPr>
+        <w:t xml:space="preserve">Note. </w:t>
+      </w:r>
+      <w:r>
+        <w:rPr>
           <w:sz w:val="20"/>
           <w:szCs w:val="20"/>
         </w:rPr>
-        <w:t xml:space="preserve">Note. </w:t>
-      </w:r>
-      <w:r>
-        <w:rPr>
-          <w:sz w:val="20"/>
-          <w:szCs w:val="20"/>
-        </w:rPr>
-        <w:t>Illustrative recreation of the settings screen, based on the app as of October 2026.</w:t>
+        <w:t xml:space="preserve">Screenshots taken by the author on 25 October 2026; the app interface is in Bangla.</w:t>
       </w:r>
     </w:p>
     <w:p>

</xml_diff>

<commit_message>
Update cybercrime paper: author's revised sections, crest logo, title style, figure sizing to close page gaps
Co-Authored-By: Claude Opus 5.5 <noreply@anthropic.com>
Claude-Session: https://claude.ai/code/session_019knRdjk5gjNVj1XdaUpgVu
</commit_message>
<xml_diff>
--- a/cybercrime-assignment/final/24-Ahnaf.docx
+++ b/cybercrime-assignment/final/24-Ahnaf.docx
@@ -13,7 +13,7 @@
         </w:rPr>
         <w:drawing>
           <wp:inline distT="0" distB="0" distL="0" distR="0" wp14:anchorId="2626979E" wp14:editId="319342FE">
-            <wp:extent cx="1047750" cy="1047750"/>
+            <wp:extent cx="1657350" cy="1492250"/>
             <wp:effectExtent l="0" t="0" r="0" b="0"/>
             <wp:docPr id="1" name="logo" descr="University of Dhaka logo" title="University of Dhaka logo"/>
             <wp:cNvGraphicFramePr>
@@ -38,7 +38,7 @@
                   <pic:spPr bwMode="auto">
                     <a:xfrm>
                       <a:off x="0" y="0"/>
-                      <a:ext cx="1047750" cy="1047750"/>
+                      <a:ext cx="1657350" cy="1492250"/>
                     </a:xfrm>
                     <a:prstGeom prst="rect">
                       <a:avLst/>
@@ -85,8 +85,7 @@
         <w:jc w:val="center"/>
       </w:pPr>
       <w:r>
-        <w:rPr/>
-        <w:t xml:space="preserve">Professional Masters in Criminology and Criminal Justice</w:t>
+        <w:t>Professional Masters in Criminology and Criminal Justice</w:t>
       </w:r>
     </w:p>
     <w:p>
@@ -277,6 +276,9 @@
         <w:rPr>
           <w:b/>
           <w:bCs/>
+          <w:sz w:val="36"/>
+          <w:szCs w:val="36"/>
+          <w:u w:val="single"/>
         </w:rPr>
         <w:t xml:space="preserve">Locked or </w:t>
       </w:r>
@@ -285,6 +287,9 @@
         <w:rPr>
           <w:b/>
           <w:bCs/>
+          <w:sz w:val="36"/>
+          <w:szCs w:val="36"/>
+          <w:u w:val="single"/>
         </w:rPr>
         <w:t>Leaked</w:t>
       </w:r>
@@ -293,6 +298,9 @@
         <w:rPr>
           <w:b/>
           <w:bCs/>
+          <w:sz w:val="36"/>
+          <w:szCs w:val="36"/>
+          <w:u w:val="single"/>
         </w:rPr>
         <w:t>? Assessing the Security Features of Five Online Platforms</w:t>
       </w:r>
@@ -309,29 +317,49 @@
     </w:p>
     <w:p>
       <w:pPr>
-        <w:spacing w:after="160" w:line="360" w:lineRule="auto"/>
-        <w:jc w:val="both"/>
-      </w:pPr>
-      <w:r>
-        <w:rPr/>
-        <w:t xml:space="preserve">Increased dependence on online platforms has made users vulnerable to abuse. Consequently, getting exploited on online platforms can harm the victim more than getting robbed, as it damages both their reputation and their finances. In Bangladesh, almost 64 million people use Facebook (Statista, 2025). In 2024, the Cyber Crime Awareness Foundation (CCAF) conducted a study which found that hacking was the most common form of cybercrime, affecting 21.65% of victims. Of these victims, 59% were women, 78.78% were aged between 18 and 30, and only 12% reported to the police (Dhaka Tribune, 2024).</w:t>
-      </w:r>
-    </w:p>
-    <w:p>
-      <w:pPr>
-        <w:spacing w:after="160" w:line="360" w:lineRule="auto"/>
-        <w:jc w:val="both"/>
-      </w:pPr>
-      <w:r>
-        <w:rPr/>
-        <w:t xml:space="preserve">For this assessment, I examined the five most used online platforms: Facebook, Instagram, WhatsApp, Gmail and bKash. I used my own device to verify the security features of these platforms and cross-checked them against the platforms’ official pages and websites. An evaluation system was used to score the security features from 1 (weak) to 5 (strong) on five benchmarks.</w:t>
-      </w:r>
-    </w:p>
-    <w:p>
-      <w:pPr>
         <w:pStyle w:val="Heading1"/>
         <w:keepNext/>
         <w:spacing w:before="240" w:after="120" w:line="360" w:lineRule="auto"/>
+        <w:rPr>
+          <w:b w:val="0"/>
+          <w:bCs w:val="0"/>
+          <w:color w:val="auto"/>
+        </w:rPr>
+      </w:pPr>
+      <w:r>
+        <w:rPr>
+          <w:b w:val="0"/>
+          <w:bCs w:val="0"/>
+          <w:color w:val="auto"/>
+        </w:rPr>
+        <w:t>Increased dependence on online platforms has made users vulnerable to abuse. Consequently, getting exploited on online platforms harms the victim more than getting robbed, as it damages both social image and money. In Bangladesh almost 64 million people use Facebook (Statista, 2025). In 2024, the Cyber Crime Awareness Foundation (CCAF) conducted a study which found that hacking was the most common form of cybercrime, affecting 21.65% of victims. Among them, 59% were women, 78.78% were aged between 18 and 30 and only 12% reported to the police (Dhaka Tribune, 2024).</w:t>
+      </w:r>
+    </w:p>
+    <w:p>
+      <w:pPr>
+        <w:pStyle w:val="Heading1"/>
+        <w:keepNext/>
+        <w:spacing w:before="240" w:after="120" w:line="360" w:lineRule="auto"/>
+        <w:rPr>
+          <w:b w:val="0"/>
+          <w:bCs w:val="0"/>
+          <w:color w:val="auto"/>
+        </w:rPr>
+      </w:pPr>
+      <w:r>
+        <w:rPr>
+          <w:b w:val="0"/>
+          <w:bCs w:val="0"/>
+          <w:color w:val="auto"/>
+        </w:rPr>
+        <w:t>For this assessment, I examined five most used online platforms: Facebook, Instagram, WhatsApp, Gmail and bKash. I used my own phone to check the security features of these platforms and cross-checked them against the platforms’ pages and websites. An evaluation system was used to score the security features from 1 (weak) to 5 (strong) on five benchmarks.</w:t>
+      </w:r>
+    </w:p>
+    <w:p>
+      <w:pPr>
+        <w:pStyle w:val="Heading1"/>
+        <w:keepNext/>
+        <w:spacing w:before="240" w:after="120" w:line="360" w:lineRule="auto"/>
       </w:pPr>
       <w:r>
         <w:t>2. Existing Security Features</w:t>
@@ -353,8 +381,7 @@
         <w:jc w:val="both"/>
       </w:pPr>
       <w:r>
-        <w:rPr/>
-        <w:t xml:space="preserve">Facebook’s two-factor authentication (2FA) adds an extra layer of authentication through an SMS code, an authenticator app or a physical security key. It also sends a login alert as a warning if someone logs in from an unfamiliar device. The “Where you’re logged in” feature shows every device and lets the user log out remotely. A Security Checkup feature gives a step-by-step guide through these settings. The newest feature of Facebook is passkeys, which let the user log in with a fingerprint or face scan instead of a password. Passkeys arrived in 2025 and were extended to Messenger in September 2025 (Meta, 2025).</w:t>
+        <w:t>Facebook’s two-factor authentication (2FA) adds an extra layer of authentication through an SMS code, an authenticator app or a physical security key. It also sends a login alert as a warning if someone logs in from an unfamiliar device. The “Where you’re logged in” feature shows every device and lets the user log out remotely. A Security Checkup feature gives a step-by-step guide through these settings. The newest feature of Facebook is passkeys, which let the user log in with a fingerprint or face scan instead of a password. Passkeys arrived in 2025 and were extended to Messenger in September 2025 (Meta, 2025).</w:t>
       </w:r>
     </w:p>
     <w:p>
@@ -380,7 +407,7 @@
           <w:i/>
           <w:iCs/>
         </w:rPr>
-        <w:t xml:space="preserve">Facebook → Settings &amp; privacy → Accounts Center → Login and security</w:t>
+        <w:t>Facebook → Settings &amp; privacy → Accounts Center → Login and security</w:t>
       </w:r>
     </w:p>
     <w:p>
@@ -395,7 +422,7 @@
         </w:rPr>
         <w:drawing>
           <wp:inline distT="0" distB="0" distL="0" distR="0" wp14:anchorId="797DE5C2" wp14:editId="6DE43B5C">
-            <wp:extent cx="2377440" cy="3195015"/>
+            <wp:extent cx="1600200" cy="2150491"/>
             <wp:effectExtent l="0" t="0" r="0" b="0"/>
             <wp:docPr id="822376994" name="fig1" descr="Facebook → Settings &amp; privacy → Accounts Center → Login and security" title="Facebook → Settings &amp; privacy → Accounts Center → Login and security"/>
             <wp:cNvGraphicFramePr>
@@ -420,7 +447,7 @@
                   <pic:spPr bwMode="auto">
                     <a:xfrm>
                       <a:off x="0" y="0"/>
-                      <a:ext cx="2377440" cy="3195015"/>
+                      <a:ext cx="1600200" cy="2150491"/>
                     </a:xfrm>
                     <a:prstGeom prst="rect">
                       <a:avLst/>
@@ -439,10 +466,10 @@
       </w:pPr>
       <w:r>
         <w:rPr>
+          <w:i/>
+          <w:iCs/>
           <w:sz w:val="20"/>
           <w:szCs w:val="20"/>
-          <w:i/>
-          <w:iCs/>
         </w:rPr>
         <w:t xml:space="preserve">Note. </w:t>
       </w:r>
@@ -451,7 +478,7 @@
           <w:sz w:val="20"/>
           <w:szCs w:val="20"/>
         </w:rPr>
-        <w:t xml:space="preserve">Screenshot taken by the author on 25 October 2026.</w:t>
+        <w:t>Screenshot taken by the author on 25 October 2026.</w:t>
       </w:r>
     </w:p>
     <w:p>
@@ -470,8 +497,7 @@
         <w:jc w:val="both"/>
       </w:pPr>
       <w:r>
-        <w:rPr/>
-        <w:t xml:space="preserve">Instagram’s login protection features are the same as Facebook’s. Instagram has a unique “Emails from Instagram” feature, which lists the real security emails Instagram has sent in the last 14 days. It protects users from harassment through Restrict, Hidden Words and limits on message requests, which block abusive messages. Teen Accounts are private by default for users under 18. However, Meta removed its optional encrypted chats on 8 May 2026 (Euronews, 2026), which means Meta can access the content of private messages. Instagram is therefore vulnerable to sextortion and image-based blackmail, which often start in private messages.</w:t>
+        <w:t>Instagram’s login protection features are the same as Facebook’s. Instagram has a unique “Emails from Instagram” feature, which lists the real security emails Instagram has sent in the last 14 days. It protects users from harassment through Restrict, Hidden Words and limits on message requests, which block abusive messages. Teen Accounts are private by default for users under 18. However, Meta removed its optional encrypted chats on 8 May 2026 (Euronews, 2026), which means Meta can access the content of private messages. Instagram is therefore vulnerable to sextortion and image-based blackmail, which often start in private messages.</w:t>
       </w:r>
     </w:p>
     <w:p>
@@ -497,7 +523,7 @@
           <w:i/>
           <w:iCs/>
         </w:rPr>
-        <w:t xml:space="preserve">Instagram → Profile → Menu → Accounts Center → Password and security</w:t>
+        <w:t>Instagram → Profile → Menu → Accounts Center → Password and security</w:t>
       </w:r>
     </w:p>
     <w:p>
@@ -512,7 +538,7 @@
         </w:rPr>
         <w:drawing>
           <wp:inline distT="0" distB="0" distL="0" distR="0" wp14:anchorId="67C62A3C" wp14:editId="384F3CB4">
-            <wp:extent cx="2377440" cy="2073656"/>
+            <wp:extent cx="1828800" cy="1595120"/>
             <wp:effectExtent l="0" t="0" r="0" b="0"/>
             <wp:docPr id="234644435" name="fig2" descr="Instagram → Profile → Menu → Accounts Center → Password and security" title="Instagram → Profile → Menu → Accounts Center → Password and security"/>
             <wp:cNvGraphicFramePr>
@@ -537,7 +563,7 @@
                   <pic:spPr bwMode="auto">
                     <a:xfrm>
                       <a:off x="0" y="0"/>
-                      <a:ext cx="2377440" cy="2073656"/>
+                      <a:ext cx="1828800" cy="1595120"/>
                     </a:xfrm>
                     <a:prstGeom prst="rect">
                       <a:avLst/>
@@ -556,10 +582,10 @@
       </w:pPr>
       <w:r>
         <w:rPr>
+          <w:i/>
+          <w:iCs/>
           <w:sz w:val="20"/>
           <w:szCs w:val="20"/>
-          <w:i/>
-          <w:iCs/>
         </w:rPr>
         <w:t xml:space="preserve">Note. </w:t>
       </w:r>
@@ -568,7 +594,7 @@
           <w:sz w:val="20"/>
           <w:szCs w:val="20"/>
         </w:rPr>
-        <w:t xml:space="preserve">Screenshot taken by the author on 25 October 2026.</w:t>
+        <w:t>Screenshot taken by the author on 25 October 2026.</w:t>
       </w:r>
     </w:p>
     <w:p>
@@ -587,8 +613,7 @@
         <w:jc w:val="both"/>
       </w:pPr>
       <w:r>
-        <w:rPr/>
-        <w:t xml:space="preserve">WhatsApp encrypts every chat, call and status update end to end by default. It has extra login protection such as two-step verification, passkey login, chat lock, “Silence unknown callers” and IP protection in calls. Since October 2025, chat backups can be protected with a passkey instead of a 64-digit key (Help Net Security, 2025). In January 2026, it added Strict Account Settings, which locks everything to the safest options with one tap (WhatsApp, 2026). However, WhatsApp verifies a login by sending a code to the user’s phone number, and scammers exploit this. If the user shares the code, the scammer can take over the account. A two-step PIN prevents this, but many users do not set one up.</w:t>
+        <w:t>WhatsApp encrypts every chat, call and status update end to end by default. It has extra login protection such as two-step verification, passkey login, chat lock, “Silence unknown callers” and IP protection in calls. Since October 2025, chat backups can be protected with a passkey instead of a 64-digit key (Help Net Security, 2025). In January 2026, it added Strict Account Settings, which locks everything to the safest options with one tap (WhatsApp, 2026). However, WhatsApp verifies a login by sending a code to the user’s phone number, and scammers exploit this. If the user shares the code, the scammer can take over the account. A two-step PIN prevents this, but many users do not set one up.</w:t>
       </w:r>
     </w:p>
     <w:p>
@@ -614,7 +639,7 @@
           <w:i/>
           <w:iCs/>
         </w:rPr>
-        <w:t xml:space="preserve">WhatsApp → Settings → Privacy</w:t>
+        <w:t>WhatsApp → Settings → Privacy</w:t>
       </w:r>
     </w:p>
     <w:p>
@@ -629,7 +654,7 @@
         </w:rPr>
         <w:drawing>
           <wp:inline distT="0" distB="0" distL="0" distR="0" wp14:anchorId="52D8975D" wp14:editId="5A3399AF">
-            <wp:extent cx="2377440" cy="3641446"/>
+            <wp:extent cx="1600200" cy="2450973"/>
             <wp:effectExtent l="0" t="0" r="0" b="0"/>
             <wp:docPr id="1862344118" name="fig3" descr="WhatsApp → Settings → Privacy" title="WhatsApp → Settings → Privacy"/>
             <wp:cNvGraphicFramePr>
@@ -654,7 +679,7 @@
                   <pic:spPr bwMode="auto">
                     <a:xfrm>
                       <a:off x="0" y="0"/>
-                      <a:ext cx="2377440" cy="3641446"/>
+                      <a:ext cx="1600200" cy="2450973"/>
                     </a:xfrm>
                     <a:prstGeom prst="rect">
                       <a:avLst/>
@@ -673,10 +698,10 @@
       </w:pPr>
       <w:r>
         <w:rPr>
+          <w:i/>
+          <w:iCs/>
           <w:sz w:val="20"/>
           <w:szCs w:val="20"/>
-          <w:i/>
-          <w:iCs/>
         </w:rPr>
         <w:t xml:space="preserve">Note. </w:t>
       </w:r>
@@ -685,7 +710,7 @@
           <w:sz w:val="20"/>
           <w:szCs w:val="20"/>
         </w:rPr>
-        <w:t xml:space="preserve">Screenshot taken by the author on 25 October 2026.</w:t>
+        <w:t>Screenshot taken by the author on 25 October 2026.</w:t>
       </w:r>
     </w:p>
     <w:p>
@@ -730,7 +755,7 @@
           <w:i/>
           <w:iCs/>
         </w:rPr>
-        <w:t xml:space="preserve">Gmail → Profile picture → Manage your Google Account → Security and sign-in</w:t>
+        <w:t>Gmail → Profile picture → Manage your Google Account → Security and sign-in</w:t>
       </w:r>
     </w:p>
     <w:p>
@@ -745,7 +770,7 @@
         </w:rPr>
         <w:drawing>
           <wp:inline distT="0" distB="0" distL="0" distR="0" wp14:anchorId="089BB2AF" wp14:editId="58228A76">
-            <wp:extent cx="2377440" cy="2316683"/>
+            <wp:extent cx="1828800" cy="1782064"/>
             <wp:effectExtent l="0" t="0" r="0" b="0"/>
             <wp:docPr id="1351789678" name="fig4" descr="Gmail → Profile picture → Manage your Google Account → Security and sign-in" title="Gmail → Profile picture → Manage your Google Account → Security and sign-in"/>
             <wp:cNvGraphicFramePr>
@@ -770,7 +795,7 @@
                   <pic:spPr bwMode="auto">
                     <a:xfrm>
                       <a:off x="0" y="0"/>
-                      <a:ext cx="2377440" cy="2316683"/>
+                      <a:ext cx="1828800" cy="1782064"/>
                     </a:xfrm>
                     <a:prstGeom prst="rect">
                       <a:avLst/>
@@ -789,10 +814,10 @@
       </w:pPr>
       <w:r>
         <w:rPr>
+          <w:i/>
+          <w:iCs/>
           <w:sz w:val="20"/>
           <w:szCs w:val="20"/>
-          <w:i/>
-          <w:iCs/>
         </w:rPr>
         <w:t xml:space="preserve">Note. </w:t>
       </w:r>
@@ -801,7 +826,7 @@
           <w:sz w:val="20"/>
           <w:szCs w:val="20"/>
         </w:rPr>
-        <w:t xml:space="preserve">Screenshot taken by the author on 25 October 2026; personal details have been cropped out.</w:t>
+        <w:t>Screenshot taken by the author on 25 October 2026; personal details have been cropped out.</w:t>
       </w:r>
     </w:p>
     <w:p>
@@ -819,20 +844,27 @@
     </w:p>
     <w:p>
       <w:pPr>
-        <w:spacing w:after="160" w:line="360" w:lineRule="auto"/>
-        <w:jc w:val="both"/>
-      </w:pPr>
-      <w:r>
-        <w:rPr/>
-        <w:t xml:space="preserve">The bKash app verifies the first login with an OTP sent to the user’s phone. For every login and transaction, the user needs to enter a PIN. The app logs out automatically after inactivity and hides the user’s balance after a few seconds. bKash introduced Face ID and fingerprint login in December 2023 (Bangladesh Sangbad Sangstha, 2023). The biggest weakness of bKash is its users. Scammers often trick users into reading out an OTP that the scammers request intentionally using the victim’s number. They pretend to be an agent who sent money by mistake, a bKash official or someone else. Common pretexts are that the account may be blocked, that money sent by mistake needs to be reversed, or that the victim has won a prize. Police have arrested people running these scams (The Financial Express, 2020).</w:t>
-      </w:r>
-    </w:p>
-    <w:p>
-      <w:pPr>
         <w:keepNext/>
         <w:spacing w:before="120" w:line="360" w:lineRule="auto"/>
       </w:pPr>
       <w:r>
+        <w:t xml:space="preserve">bKash application verifies the first login with an OTP code and needs a PIN for every login and transaction. bKash introduced Face ID and fingerprint login in December 2023 (Bangladesh Sangbad </w:t>
+      </w:r>
+      <w:proofErr w:type="spellStart"/>
+      <w:r>
+        <w:t>Sangstha</w:t>
+      </w:r>
+      <w:proofErr w:type="spellEnd"/>
+      <w:r>
+        <w:t>, 2023). The biggest weakness for bKash is the users. Scammers pretend to be an agent or a bKash official and trick users into reading out the OTP code. Scammers running these scams have been arrested by police (The Financial Express, 2020).</w:t>
+      </w:r>
+    </w:p>
+    <w:p>
+      <w:pPr>
+        <w:keepNext/>
+        <w:spacing w:before="120" w:line="360" w:lineRule="auto"/>
+      </w:pPr>
+      <w:r>
         <w:rPr>
           <w:b/>
           <w:bCs/>
@@ -850,7 +882,7 @@
           <w:i/>
           <w:iCs/>
         </w:rPr>
-        <w:t xml:space="preserve">bKash app → My Profile → Touch/Face ID (top) and the Forgot PIN screen (bottom)</w:t>
+        <w:t>bKash app → My Profile → Touch/Face ID (top) and the Forgot PIN screen (bottom)</w:t>
       </w:r>
     </w:p>
     <w:p>
@@ -865,7 +897,7 @@
         </w:rPr>
         <w:drawing>
           <wp:inline distT="0" distB="0" distL="0" distR="0" wp14:anchorId="4026B51F" wp14:editId="27FF4174">
-            <wp:extent cx="2011680" cy="3492500"/>
+            <wp:extent cx="1463040" cy="2540000"/>
             <wp:effectExtent l="0" t="0" r="0" b="0"/>
             <wp:docPr id="1198581341" name="fig5" descr="bKash app → My Profile → Touch/Face ID (top) and the Forgot PIN screen (bottom)" title="bKash app → My Profile → Touch/Face ID (top) and the Forgot PIN screen (bottom)"/>
             <wp:cNvGraphicFramePr>
@@ -890,7 +922,7 @@
                   <pic:spPr bwMode="auto">
                     <a:xfrm>
                       <a:off x="0" y="0"/>
-                      <a:ext cx="2011680" cy="3492500"/>
+                      <a:ext cx="1463040" cy="2540000"/>
                     </a:xfrm>
                     <a:prstGeom prst="rect">
                       <a:avLst/>
@@ -909,10 +941,10 @@
       </w:pPr>
       <w:r>
         <w:rPr>
+          <w:i/>
+          <w:iCs/>
           <w:sz w:val="20"/>
           <w:szCs w:val="20"/>
-          <w:i/>
-          <w:iCs/>
         </w:rPr>
         <w:t xml:space="preserve">Note. </w:t>
       </w:r>
@@ -921,7 +953,7 @@
           <w:sz w:val="20"/>
           <w:szCs w:val="20"/>
         </w:rPr>
-        <w:t xml:space="preserve">Screenshots taken by the author on 25 October 2026; the app interface is in Bangla.</w:t>
+        <w:t>Screenshots taken by the author on 25 October 2026; the app interface is in Bangla.</w:t>
       </w:r>
     </w:p>
     <w:p>
@@ -940,8 +972,7 @@
         <w:jc w:val="both"/>
       </w:pPr>
       <w:r>
-        <w:rPr/>
-        <w:t xml:space="preserve">The strongest ones are mostly optional, hidden or designed for a global audience rather than for Bangladeshi users. Table 1 lists the features I propose.</w:t>
+        <w:t>The strongest ones are mostly optional, hidden or designed for a global audience rather than for Bangladeshi users. Table 1 lists the features I propose.</w:t>
       </w:r>
     </w:p>
     <w:p>
@@ -1154,7 +1185,7 @@
                 <w:sz w:val="20"/>
                 <w:szCs w:val="20"/>
               </w:rPr>
-              <w:t xml:space="preserve">A waiting time of 48 hours before a new email, a new phone number or a 2FA change takes effect</w:t>
+              <w:t>A waiting time of 48 hours before a new email is registered, a phone number added or 2FA changed</w:t>
             </w:r>
           </w:p>
         </w:tc>
@@ -1183,7 +1214,7 @@
                 <w:sz w:val="20"/>
                 <w:szCs w:val="20"/>
               </w:rPr>
-              <w:t xml:space="preserve">Hackers and scammers can currently change the email and phone number within seconds</w:t>
+              <w:t>Hackers and scammers currently have the window to change email and phone number within seconds</w:t>
             </w:r>
           </w:p>
         </w:tc>
@@ -1248,7 +1279,7 @@
                 <w:sz w:val="20"/>
                 <w:szCs w:val="20"/>
               </w:rPr>
-              <w:t xml:space="preserve">End-to-end encryption for DMs and blurring of explicit images</w:t>
+              <w:t>End to end encryption for DM and blurred images</w:t>
             </w:r>
           </w:p>
         </w:tc>
@@ -1277,7 +1308,7 @@
                 <w:sz w:val="20"/>
                 <w:szCs w:val="20"/>
               </w:rPr>
-              <w:t xml:space="preserve">Sextortion often starts in DMs</w:t>
+              <w:t>Sextortion in DM</w:t>
             </w:r>
           </w:p>
         </w:tc>
@@ -1342,7 +1373,7 @@
                 <w:sz w:val="20"/>
                 <w:szCs w:val="20"/>
               </w:rPr>
-              <w:t xml:space="preserve">A warning in Bangla when a code is requested and a two-step PIN for new accounts</w:t>
+              <w:t>A warning sign in Bangla for requested code and two step PIN for new accounts</w:t>
             </w:r>
           </w:p>
         </w:tc>
@@ -1371,7 +1402,7 @@
                 <w:sz w:val="20"/>
                 <w:szCs w:val="20"/>
               </w:rPr>
-              <w:t xml:space="preserve">Code-sharing scams are the most common cause of account takeover</w:t>
+              <w:t>Code sharing scams are more common</w:t>
             </w:r>
           </w:p>
         </w:tc>
@@ -1436,7 +1467,7 @@
                 <w:sz w:val="20"/>
                 <w:szCs w:val="20"/>
               </w:rPr>
-              <w:t xml:space="preserve">Warning messages for fake bKash, Nagad and bank emails</w:t>
+              <w:t>Warning message for fake bKash, Nagad and bank email</w:t>
             </w:r>
           </w:p>
         </w:tc>
@@ -1469,7 +1500,7 @@
                 <w:sz w:val="20"/>
                 <w:szCs w:val="20"/>
               </w:rPr>
-              <w:t xml:space="preserve">Email is used to reset other accounts, and phishing scams are common</w:t>
+              <w:t>Other accounts are reset by email and phishing scams are more</w:t>
             </w:r>
           </w:p>
         </w:tc>
@@ -1504,12 +1535,12 @@
             </w:pPr>
             <w:r>
               <w:rPr>
-                <w:sz w:val="20"/>
-                <w:szCs w:val="20"/>
                 <w:b/>
                 <w:bCs/>
-              </w:rPr>
-              <w:t xml:space="preserve">bKash</w:t>
+                <w:sz w:val="20"/>
+                <w:szCs w:val="20"/>
+              </w:rPr>
+              <w:t>bKash</w:t>
             </w:r>
           </w:p>
         </w:tc>
@@ -1542,7 +1573,7 @@
                 <w:sz w:val="20"/>
                 <w:szCs w:val="20"/>
               </w:rPr>
-              <w:t xml:space="preserve">A separate warning for PIN reset code requests and a short hold on transfers after a PIN reset code is sent</w:t>
+              <w:t>A separate warning sign for PIN reset code request and a short hold on transfer after a PIN reset code is sent</w:t>
             </w:r>
           </w:p>
         </w:tc>
@@ -1571,7 +1602,7 @@
                 <w:sz w:val="20"/>
                 <w:szCs w:val="20"/>
               </w:rPr>
-              <w:t xml:space="preserve">Scammers most commonly abuse the “forgot PIN” option to take over accounts and transfer money</w:t>
+              <w:t>Scammers most commonly abuse the forgot PIN option to take hold of account and money transfer</w:t>
             </w:r>
           </w:p>
         </w:tc>
@@ -1595,8 +1626,7 @@
         <w:jc w:val="both"/>
       </w:pPr>
       <w:r>
-        <w:rPr/>
-        <w:t xml:space="preserve">The strongest protection features should be turned on by default to reduce scams and hacking incidents.</w:t>
+        <w:t>The strongest protection features should be turned on by default to reduce scams and hacking incidents.</w:t>
       </w:r>
     </w:p>
     <w:p>
@@ -3023,10 +3053,10 @@
       </w:pPr>
       <w:r>
         <w:rPr>
+          <w:i/>
+          <w:iCs/>
           <w:sz w:val="20"/>
           <w:szCs w:val="20"/>
-          <w:i/>
-          <w:iCs/>
         </w:rPr>
         <w:t xml:space="preserve">Note. </w:t>
       </w:r>
@@ -3035,7 +3065,7 @@
           <w:sz w:val="20"/>
           <w:szCs w:val="20"/>
         </w:rPr>
-        <w:t xml:space="preserve">Scores are the writer’s assessment of the default and available settings as of October 2026.</w:t>
+        <w:t>Scores are the writer’s assessment of the default and available settings as of October 2026.</w:t>
       </w:r>
     </w:p>
     <w:p>
@@ -3044,8 +3074,7 @@
         <w:jc w:val="both"/>
       </w:pPr>
       <w:r>
-        <w:rPr/>
-        <w:t xml:space="preserve">WhatsApp and Gmail scored the highest (20 out of 25), while bKash scored the lowest (15 out of 25). Other platforms like Facebook and Instagram scored moderately (16 out of 25) due to their differences in strength and weakness.</w:t>
+        <w:t>WhatsApp and Gmail scored the highest (20 out of 25), while bKash scored the lowest (15 out of 25). Other platforms like Facebook and Instagram scored moderately (16 out of 25) due to their differences in strength and weakness.</w:t>
       </w:r>
     </w:p>
     <w:p>
@@ -3064,8 +3093,7 @@
         <w:jc w:val="both"/>
       </w:pPr>
       <w:r>
-        <w:rPr/>
-        <w:t xml:space="preserve">All online platforms have security features, which vary with their design and user experience. However, some platforms have higher standards of security and encryption, while others have fewer. Overall, users are the weakest link in most scams, as scammers trick them into getting around the existing security features. The solution is for online platforms to assess the types of scams qualitatively and modify their security features accordingly.</w:t>
+        <w:t>All online platforms have security features, which vary with their design and user experience. However, some platforms have higher standards of security and encryption, while others have fewer. Overall, users are the weakest link in most scams, as scammers trick them into getting around the existing security features. The solution is for online platforms to assess the types of scams qualitatively and modify their security features accordingly.</w:t>
       </w:r>
     </w:p>
     <w:p>
@@ -3092,7 +3120,6 @@
         <w:ind w:left="720" w:hanging="720"/>
       </w:pPr>
       <w:r>
-        <w:rPr/>
         <w:t xml:space="preserve">Bangladesh Sangbad Sangstha. (2023, December 4). </w:t>
       </w:r>
       <w:r>
@@ -3100,11 +3127,10 @@
           <w:i/>
           <w:iCs/>
         </w:rPr>
-        <w:t xml:space="preserve">With ‘Face ID’, ‘fingerprint’ login bKash app is now more secure</w:t>
-      </w:r>
-      <w:r>
-        <w:rPr/>
-        <w:t xml:space="preserve">. https://www.bssnews.net/business/161466</w:t>
+        <w:t>With ‘Face ID’, ‘fingerprint’ login bKash app is now more secure</w:t>
+      </w:r>
+      <w:r>
+        <w:t>. https://www.bssnews.net/business/161466</w:t>
       </w:r>
     </w:p>
     <w:p>
@@ -3113,7 +3139,6 @@
         <w:ind w:left="720" w:hanging="720"/>
       </w:pPr>
       <w:r>
-        <w:rPr/>
         <w:t xml:space="preserve">Dhaka Tribune. (2024, June 29). </w:t>
       </w:r>
       <w:r>
@@ -3121,11 +3146,10 @@
           <w:i/>
           <w:iCs/>
         </w:rPr>
-        <w:t xml:space="preserve">Cybercrime study: Social media hacking most prevalent</w:t>
-      </w:r>
-      <w:r>
-        <w:rPr/>
-        <w:t xml:space="preserve">. https://www.dhakatribune.com/bangladesh/crime/350507/cybercrime-study-social-media-hacking-most</w:t>
+        <w:t>Cybercrime study: Social media hacking most prevalent</w:t>
+      </w:r>
+      <w:r>
+        <w:t>. https://www.dhakatribune.com/bangladesh/crime/350507/cybercrime-study-social-media-hacking-most</w:t>
       </w:r>
     </w:p>
     <w:p>
@@ -3134,7 +3158,6 @@
         <w:ind w:left="720" w:hanging="720"/>
       </w:pPr>
       <w:r>
-        <w:rPr/>
         <w:t xml:space="preserve">Engadget. (2025, September 2). </w:t>
       </w:r>
       <w:r>
@@ -3142,11 +3165,10 @@
           <w:i/>
           <w:iCs/>
         </w:rPr>
-        <w:t xml:space="preserve">Google says reports of a major Gmail security issue are ‘entirely false’</w:t>
-      </w:r>
-      <w:r>
-        <w:rPr/>
-        <w:t xml:space="preserve">. https://www.engadget.com/google-says-reports-of-a-major-gmail-security-issue-are-entirely-false-224812292.html</w:t>
+        <w:t>Google says reports of a major Gmail security issue are ‘entirely false’</w:t>
+      </w:r>
+      <w:r>
+        <w:t>. https://www.engadget.com/google-says-reports-of-a-major-gmail-security-issue-are-entirely-false-224812292.html</w:t>
       </w:r>
     </w:p>
     <w:p>
@@ -3155,7 +3177,6 @@
         <w:ind w:left="720" w:hanging="720"/>
       </w:pPr>
       <w:r>
-        <w:rPr/>
         <w:t xml:space="preserve">Euronews. (2026, May 8). </w:t>
       </w:r>
       <w:r>
@@ -3163,11 +3184,10 @@
           <w:i/>
           <w:iCs/>
         </w:rPr>
-        <w:t xml:space="preserve">Instagram is dropping end-to-end encrypted chats: This is what is changing</w:t>
-      </w:r>
-      <w:r>
-        <w:rPr/>
-        <w:t xml:space="preserve">. https://www.euronews.com/next/2026/05/08/instagram-is-dropping-end-to-end-encrypted-chats-this-is-what-is-changing</w:t>
+        <w:t>Instagram is dropping end-to-end encrypted chats: This is what is changing</w:t>
+      </w:r>
+      <w:r>
+        <w:t>. https://www.euronews.com/next/2026/05/08/instagram-is-dropping-end-to-end-encrypted-chats-this-is-what-is-changing</w:t>
       </w:r>
     </w:p>
     <w:p>
@@ -3176,7 +3196,6 @@
         <w:ind w:left="720" w:hanging="720"/>
       </w:pPr>
       <w:r>
-        <w:rPr/>
         <w:t xml:space="preserve">The Financial Express. (2020, December 24). </w:t>
       </w:r>
       <w:r>
@@ -3184,11 +3203,10 @@
           <w:i/>
           <w:iCs/>
         </w:rPr>
-        <w:t xml:space="preserve">Police arrest three fraud gang members in city</w:t>
-      </w:r>
-      <w:r>
-        <w:rPr/>
-        <w:t xml:space="preserve">. https://thefinancialexpress.com.bd/national/crime/police-arrest-three-fraud-gang-members-in-city-1608812154</w:t>
+        <w:t>Police arrest three fraud gang members in city</w:t>
+      </w:r>
+      <w:r>
+        <w:t>. https://thefinancialexpress.com.bd/national/crime/police-arrest-three-fraud-gang-members-in-city-1608812154</w:t>
       </w:r>
     </w:p>
     <w:p>
@@ -3197,7 +3215,6 @@
         <w:ind w:left="720" w:hanging="720"/>
       </w:pPr>
       <w:r>
-        <w:rPr/>
         <w:t xml:space="preserve">Google. (2023, October 10). </w:t>
       </w:r>
       <w:r>
@@ -3205,11 +3222,10 @@
           <w:i/>
           <w:iCs/>
         </w:rPr>
-        <w:t xml:space="preserve">Passwordless by default: Make the switch to passkeys</w:t>
-      </w:r>
-      <w:r>
-        <w:rPr/>
-        <w:t xml:space="preserve">. The Keyword. https://blog.google/technology/safety-security/passkeys-default-google-accounts/</w:t>
+        <w:t>Passwordless by default: Make the switch to passkeys</w:t>
+      </w:r>
+      <w:r>
+        <w:t>. The Keyword. https://blog.google/technology/safety-security/passkeys-default-google-accounts/</w:t>
       </w:r>
     </w:p>
     <w:p>
@@ -3218,7 +3234,6 @@
         <w:ind w:left="720" w:hanging="720"/>
       </w:pPr>
       <w:r>
-        <w:rPr/>
         <w:t xml:space="preserve">Help Net Security. (2025, October 30). </w:t>
       </w:r>
       <w:r>
@@ -3226,11 +3241,10 @@
           <w:i/>
           <w:iCs/>
         </w:rPr>
-        <w:t xml:space="preserve">WhatsApp now lets you secure chat backups with passkeys</w:t>
-      </w:r>
-      <w:r>
-        <w:rPr/>
-        <w:t xml:space="preserve">. https://www.helpnetsecurity.com/2025/10/30/whatsapp-secure-chat-backups-passkeys/</w:t>
+        <w:t>WhatsApp now lets you secure chat backups with passkeys</w:t>
+      </w:r>
+      <w:r>
+        <w:t>. https://www.helpnetsecurity.com/2025/10/30/whatsapp-secure-chat-backups-passkeys/</w:t>
       </w:r>
     </w:p>
     <w:p>
@@ -3239,7 +3253,6 @@
         <w:ind w:left="720" w:hanging="720"/>
       </w:pPr>
       <w:r>
-        <w:rPr/>
         <w:t xml:space="preserve">Meta. (2025, June 18). </w:t>
       </w:r>
       <w:r>
@@ -3247,10 +3260,9 @@
           <w:i/>
           <w:iCs/>
         </w:rPr>
-        <w:t xml:space="preserve">Introducing passkeys on Facebook for an easier sign-in</w:t>
-      </w:r>
-      <w:r>
-        <w:rPr/>
+        <w:t>Introducing passkeys on Facebook for an easier sign-in</w:t>
+      </w:r>
+      <w:r>
         <w:t xml:space="preserve"> (Updated September 23, 2025). Meta Newsroom. https://about.fb.com/news/2025/06/introducing-passkeys-facebook-easier-sign-in/</w:t>
       </w:r>
     </w:p>
@@ -3260,7 +3272,6 @@
         <w:ind w:left="720" w:hanging="720"/>
       </w:pPr>
       <w:r>
-        <w:rPr/>
         <w:t xml:space="preserve">Statista. (2025). </w:t>
       </w:r>
       <w:r>
@@ -3268,11 +3279,10 @@
           <w:i/>
           <w:iCs/>
         </w:rPr>
-        <w:t xml:space="preserve">Countries with the most Facebook users as of October 2025</w:t>
-      </w:r>
-      <w:r>
-        <w:rPr/>
-        <w:t xml:space="preserve">. https://www.statista.com/statistics/268136/top-15-countries-based-on-number-of-facebook-users/</w:t>
+        <w:t>Countries with the most Facebook users as of October 2025</w:t>
+      </w:r>
+      <w:r>
+        <w:t>. https://www.statista.com/statistics/268136/top-15-countries-based-on-number-of-facebook-users/</w:t>
       </w:r>
     </w:p>
     <w:p>
@@ -3281,7 +3291,6 @@
         <w:ind w:left="720" w:hanging="720"/>
       </w:pPr>
       <w:r>
-        <w:rPr/>
         <w:t xml:space="preserve">WhatsApp. (2026, January 27). </w:t>
       </w:r>
       <w:r>
@@ -3289,16 +3298,15 @@
           <w:i/>
           <w:iCs/>
         </w:rPr>
-        <w:t xml:space="preserve">WhatsApp’s latest privacy protection: Strict account settings</w:t>
-      </w:r>
-      <w:r>
-        <w:rPr/>
-        <w:t xml:space="preserve">. WhatsApp Blog. https://blog.whatsapp.com/whatsapps-latest-privacy-protection-strict-account-settings</w:t>
+        <w:t>WhatsApp’s latest privacy protection: Strict account settings</w:t>
+      </w:r>
+      <w:r>
+        <w:t>. WhatsApp Blog. https://blog.whatsapp.com/whatsapps-latest-privacy-protection-strict-account-settings</w:t>
       </w:r>
     </w:p>
     <w:sectPr>
-      <w:footerReference w:type="default" r:id="rId23"/>
-      <w:footerReference w:type="first" r:id="rId24"/>
+      <w:footerReference w:type="default" r:id="rId13"/>
+      <w:footerReference w:type="first" r:id="rId14"/>
       <w:pgSz w:w="11906" w:h="16838"/>
       <w:pgMar w:top="1440" w:right="1440" w:bottom="1440" w:left="1440" w:header="708" w:footer="708" w:gutter="0"/>
       <w:cols w:space="720"/>
@@ -3973,7 +3981,6 @@
   <w:style w:type="character" w:default="1" w:styleId="DefaultParagraphFont">
     <w:name w:val="Default Paragraph Font"/>
     <w:uiPriority w:val="1"/>
-    <w:semiHidden/>
     <w:unhideWhenUsed/>
   </w:style>
   <w:style w:type="table" w:default="1" w:styleId="TableNormal">

</xml_diff>